<commit_message>
vpscreen-scan: vpscreen-scan 2026-10-01: 9 stocks processed (1 trusted-x-watch, 8 fresh discovery incl. NSE IPO); 2 HIGH CAUTION governance flags (JM Financial, Ganesh Benzoplast - core business being divested); 0/9 cleared thesis-fit bar (2 mega/large-cap quality names, rest no-catalyst or red-flagged)
Co-Authored-By: Claude Sonnet 5 <noreply@anthropic.com>
</commit_message>
<xml_diff>
--- a/projects/valuepickr-open-screen/docs/National Stock Exchange of India Ltd (NSE).docx
+++ b/projects/valuepickr-open-screen/docs/National Stock Exchange of India Ltd (NSE).docx
@@ -32,7 +32,7 @@
           <w:sz w:val="22"/>
           <w:szCs w:val="22"/>
         </w:rPr>
-        <w:t xml:space="preserve">ENTITY NOT YET LISTED/TRADABLE as of this write-up date (2026-09-15) - IPO subscription opens 2026-09-17, listing scheduled 2026-09-24. This is a status note, not a verified equity research verdict.</w:t>
+        <w:t xml:space="preserve">The best business in the Indian market — a debt-free, 40%+ ROCE monopoly exchange that just IPO'd — but at Rs 4.36 lakh Cr, no multiple-based thesis is mathematically plausible</w:t>
       </w:r>
     </w:p>
     <w:p>
@@ -49,7 +49,7 @@
         <w:spacing w:after="120"/>
       </w:pPr>
       <w:r>
-        <w:t xml:space="preserve">NSE is India's largest stock exchange and multi-asset trading/clearing/listing/data/index-services platform (2,978 listed companies, ~Rs 411 lakh Cr listed market cap as of 31 March 2026 per the IPO prospectus summary). Its IPO has been long-pending for years (widely discussed on the forum and financial media, historically tied up in a co-location/regulatory-settlement overhang) and, as of today (2026-09-15), is NOT yet a tradable listed equity: the IPO subscription window opens 2026-09-17 and closes 2026-09-21, with listing on NSE &amp; BSE scheduled for 2026-09-24. The issue is a 100% offer-for-sale of ~126.44 million shares (existing shareholders selling down; no fresh capital raised), price band Rs 1,700-1,785/share, total issue size ~Rs 22,562 Cr. Per the assignment's explicit instruction, this is written up as an unresolved-entity status note rather than a normal fundamentals verdict.</w:t>
+        <w:t xml:space="preserve">India's dominant stock exchange (screen-based trading since 1994): 12.91 crore unique registered investors, 2,978 listed entities, Rs 411 lakh Cr of market cap on its platform, Rs 20.33 lakh Cr FY26 fund mobilisation. Core revenue is transaction charges (~79% of operating revenue, concentrated in equity options) plus a growing data/index/listing/GIFT City franchise. Just completed its long-awaited IPO.</w:t>
       </w:r>
     </w:p>
     <w:p>
@@ -89,7 +89,7 @@
                 <w:b/>
                 <w:bCs/>
               </w:rPr>
-              <w:t xml:space="preserve">Listing status</w:t>
+              <w:t xml:space="preserve">Market Cap</w:t>
             </w:r>
           </w:p>
         </w:tc>
@@ -99,7 +99,7 @@
           </w:tcPr>
           <w:p>
             <w:r>
-              <w:t xml:space="preserve">NOT YET LISTED as of 2026-09-15 - IPO subscription 2026-09-17 to 2026-09-21, listing scheduled 2026-09-24</w:t>
+              <w:t xml:space="preserve">Rs 4,36,355 Cr</w:t>
             </w:r>
           </w:p>
         </w:tc>
@@ -116,7 +116,7 @@
                 <w:b/>
                 <w:bCs/>
               </w:rPr>
-              <w:t xml:space="preserve">IPO price band</w:t>
+              <w:t xml:space="preserve">ROCE / ROE</w:t>
             </w:r>
           </w:p>
         </w:tc>
@@ -126,7 +126,7 @@
           </w:tcPr>
           <w:p>
             <w:r>
-              <w:t xml:space="preserve">Rs 1,700 - Rs 1,785 per share</w:t>
+              <w:t xml:space="preserve">40.6% / 28.6% (3yr avg ROE 34.5%)</w:t>
             </w:r>
           </w:p>
         </w:tc>
@@ -143,7 +143,7 @@
                 <w:b/>
                 <w:bCs/>
               </w:rPr>
-              <w:t xml:space="preserve">Issue size / structure</w:t>
+              <w:t xml:space="preserve">Operating EBITDA margin</w:t>
             </w:r>
           </w:p>
         </w:tc>
@@ -153,7 +153,7 @@
           </w:tcPr>
           <w:p>
             <w:r>
-              <w:t xml:space="preserve">~Rs 22,562 Cr, 100% offer-for-sale (~126.44 million shares); no fresh issue</w:t>
+              <w:t xml:space="preserve">66.85% (FY26)</w:t>
             </w:r>
           </w:p>
         </w:tc>
@@ -170,7 +170,7 @@
                 <w:b/>
                 <w:bCs/>
               </w:rPr>
-              <w:t xml:space="preserve">Scale (pre-listing, as disclosed)</w:t>
+              <w:t xml:space="preserve">FY26 vs FY25</w:t>
             </w:r>
           </w:p>
         </w:tc>
@@ -180,7 +180,7 @@
           </w:tcPr>
           <w:p>
             <w:r>
-              <w:t xml:space="preserve">~2,978 listed companies on the exchange; ~Rs 411 lakh Cr listed market cap (as of 31-Mar-2026); 253 million+ registered investor accounts</w:t>
+              <w:t xml:space="preserve">Revenue and PAT DECLINED — cyclical volumes</w:t>
             </w:r>
           </w:p>
         </w:tc>
@@ -197,7 +197,7 @@
                 <w:b/>
                 <w:bCs/>
               </w:rPr>
-              <w:t xml:space="preserve">Pre-IPO trading route</w:t>
+              <w:t xml:space="preserve">Balance sheet</w:t>
             </w:r>
           </w:p>
         </w:tc>
@@ -207,7 +207,7 @@
           </w:tcPr>
           <w:p>
             <w:r>
-              <w:t xml:space="preserve">Historically traded only in the illiquid unlisted/grey share market (e.g. via unlisted-share dealers) for years pending this IPO - no exchange price discovery in that market</w:t>
+              <w:t xml:space="preserve">Debt-free</w:t>
             </w:r>
           </w:p>
         </w:tc>
@@ -223,7 +223,7 @@
         <w:spacing w:after="120"/>
       </w:pPr>
       <w:r>
-        <w:t xml:space="preserve">No screener/exchange-based fundamentals exist for NSE as a listed equity as of this write-up, because it is not yet listed. The only pricing reference available is the IPO price band (Rs 1,700-1,785/share, implying the OFS values NSE at roughly the level needed to raise ~Rs 22,562 Cr from ~126.44 million shares sold) plus whatever the unlisted/grey share market has historically priced it at - neither is a substitute for post-listing exchange data (P/E, ROE, growth, debt) once trading actually begins on 2026-09-24.</w:t>
+        <w:t xml:space="preserve">Exceptional quality by any measure — network-effect monopoly, capital-light, debt-free, industry-leading margins. But the business is genuinely cyclical: FY26 revenue and PAT both declined from FY25 on softer derivatives volumes, underscoring that even a monopoly exchange isn't immune to activity cycles. The IPO itself (just completed) is the defining near-term event — providing public-market price discovery after decades as an unlisted quasi-utility.</w:t>
       </w:r>
     </w:p>
     <w:p>
@@ -240,7 +240,7 @@
         <w:spacing w:after="120"/>
       </w:pPr>
       <w:r>
-        <w:t xml:space="preserve">Not applicable - no exchange trading history exists yet.</w:t>
+        <w:t xml:space="preserve">Not pulled (fresh IPO, insufficient listed trading history).</w:t>
       </w:r>
     </w:p>
     <w:p>
@@ -257,7 +257,7 @@
         <w:spacing w:after="120"/>
       </w:pPr>
       <w:r>
-        <w:t xml:space="preserve">No forum deep-dive performed - entity status is unresolved (pre-listing) as of this write-up; re-visit after the 2026-09-24 listing with real market data.</w:t>
+        <w:t xml:space="preserve">Thin thread (8 posts, started 2026-09-22, just after IPO). One detailed bull case laying out the tollbooth/network-effect framework and quoting Buffett/Munger-style exchange economics; one governance-risk flag from 2026-09-28 (SEBI exploring a panel on exchange self-listing conflict-of-interest/governance rules).</w:t>
       </w:r>
     </w:p>
     <w:p>
@@ -278,7 +278,7 @@
           <w:sz w:val="20"/>
           <w:szCs w:val="20"/>
         </w:rPr>
-        <w:t xml:space="preserve">None sought this pass.</w:t>
+        <w:t xml:space="preserve">Elevated-tier user Satishwe posted (image only, no extractable text); karanshah137 (elevated) flagged the SEBI self-listing-panel news on 2026-09-28 — a live regulatory-structure risk specific to a newly-listed exchange.</w:t>
       </w:r>
     </w:p>
     <w:p>
@@ -295,7 +295,7 @@
         <w:spacing w:after="120"/>
       </w:pPr>
       <w:r>
-        <w:t xml:space="preserve">No red flags in the AVOID/EXCLUDE sense - this is a listing-timing issue, not a distress or fraud issue. Flagging for re-research once actually listed and trading.</w:t>
+        <w:t xml:space="preserve">SEBI reportedly considering a panel to examine self-listing rules for exchanges, addressing conflict-of-interest/governance structure questions (CNBCTV18, 2026-09-28) — monitor for framework specifics.</w:t>
       </w:r>
     </w:p>
     <w:p>
@@ -317,20 +317,46 @@
         <w:spacing w:after="60"/>
       </w:pPr>
       <w:r>
-        <w:t xml:space="preserve">Would be, once listed and trading, a rare monopoly-like exchange-infrastructure franchise with structurally growing volumes, fee income and index/data revenue</w:t>
-      </w:r>
-    </w:p>
-    <w:p>
-      <w:pPr>
-        <w:pStyle w:val="ListParagraph"/>
-        <w:numPr>
-          <w:ilvl w:val="0"/>
-          <w:numId w:val="1"/>
-        </w:numPr>
-        <w:spacing w:after="60"/>
-      </w:pPr>
-      <w:r>
-        <w:t xml:space="preserve">The IPO price band (Rs 1,700-1,785/share for a Rs 22,562 Cr OFS) gives one concrete valuation reference point once the entity is actually tradable</w:t>
+        <w:t xml:space="preserve">Textbook "tollbooth" monopoly: liquidity-begets-liquidity network effect, near-impossible for a new entrant to dislodge</w:t>
+      </w:r>
+    </w:p>
+    <w:p>
+      <w:pPr>
+        <w:pStyle w:val="ListParagraph"/>
+        <w:numPr>
+          <w:ilvl w:val="0"/>
+          <w:numId w:val="1"/>
+        </w:numPr>
+        <w:spacing w:after="60"/>
+      </w:pPr>
+      <w:r>
+        <w:t xml:space="preserve">40.6% ROCE, debt-free, 66.85% operating margin — best-in-class capital efficiency</w:t>
+      </w:r>
+    </w:p>
+    <w:p>
+      <w:pPr>
+        <w:pStyle w:val="ListParagraph"/>
+        <w:numPr>
+          <w:ilvl w:val="0"/>
+          <w:numId w:val="1"/>
+        </w:numPr>
+        <w:spacing w:after="60"/>
+      </w:pPr>
+      <w:r>
+        <w:t xml:space="preserve">Long runway: India's demat-account base (22.45 Cr) and household equity allocation still rising from a low base</w:t>
+      </w:r>
+    </w:p>
+    <w:p>
+      <w:pPr>
+        <w:pStyle w:val="ListParagraph"/>
+        <w:numPr>
+          <w:ilvl w:val="0"/>
+          <w:numId w:val="1"/>
+        </w:numPr>
+        <w:spacing w:after="60"/>
+      </w:pPr>
+      <w:r>
+        <w:t xml:space="preserve">IPO itself is a structural catalyst — public pricing, deeper liquidity, broader investor access versus the prior unlisted-market discount</w:t>
       </w:r>
     </w:p>
     <w:p>
@@ -352,33 +378,46 @@
         <w:spacing w:after="60"/>
       </w:pPr>
       <w:r>
-        <w:t xml:space="preserve">NOT a tradable listed equity as of 2026-09-15 - cannot be properly researched as an ordinary stock candidate yet</w:t>
-      </w:r>
-    </w:p>
-    <w:p>
-      <w:pPr>
-        <w:pStyle w:val="ListParagraph"/>
-        <w:numPr>
-          <w:ilvl w:val="0"/>
-          <w:numId w:val="1"/>
-        </w:numPr>
-        <w:spacing w:after="60"/>
-      </w:pPr>
-      <w:r>
-        <w:t xml:space="preserve">The only pre-listing exposure route has historically been the illiquid, opaque unlisted/grey share market (no exchange price discovery, wide bid-ask spreads, counterparty/settlement risk) - not a route this write-up endorses</w:t>
-      </w:r>
-    </w:p>
-    <w:p>
-      <w:pPr>
-        <w:pStyle w:val="ListParagraph"/>
-        <w:numPr>
-          <w:ilvl w:val="0"/>
-          <w:numId w:val="1"/>
-        </w:numPr>
-        <w:spacing w:after="60"/>
-      </w:pPr>
-      <w:r>
-        <w:t xml:space="preserve">This entry is a status note pending the 2026-09-24 listing, not a verified investment verdict - treat any conviction here as provisional until re-researched post-listing</w:t>
+        <w:t xml:space="preserve">FY26 revenue and PAT both fell from FY25 — even a monopoly exchange is volume-cyclical, especially via options-premium concentration</w:t>
+      </w:r>
+    </w:p>
+    <w:p>
+      <w:pPr>
+        <w:pStyle w:val="ListParagraph"/>
+        <w:numPr>
+          <w:ilvl w:val="0"/>
+          <w:numId w:val="1"/>
+        </w:numPr>
+        <w:spacing w:after="60"/>
+      </w:pPr>
+      <w:r>
+        <w:t xml:space="preserve">Fresh SEBI scrutiny of self-listing governance/conflict-of-interest — regulatory structure risk specific to the exchange-as-listed-company situation</w:t>
+      </w:r>
+    </w:p>
+    <w:p>
+      <w:pPr>
+        <w:pStyle w:val="ListParagraph"/>
+        <w:numPr>
+          <w:ilvl w:val="0"/>
+          <w:numId w:val="1"/>
+        </w:numPr>
+        <w:spacing w:after="60"/>
+      </w:pPr>
+      <w:r>
+        <w:t xml:space="preserve">Market cap (~Rs 4.36 lakh Cr) already prices in the quality — "everyone knows exchanges are incredible businesses, they rarely trade at a cheap price"</w:t>
+      </w:r>
+    </w:p>
+    <w:p>
+      <w:pPr>
+        <w:pStyle w:val="ListParagraph"/>
+        <w:numPr>
+          <w:ilvl w:val="0"/>
+          <w:numId w:val="1"/>
+        </w:numPr>
+        <w:spacing w:after="60"/>
+      </w:pPr>
+      <w:r>
+        <w:t xml:space="preserve">Size alone precludes any multiple-based return thesis regardless of execution</w:t>
       </w:r>
     </w:p>
     <w:p>
@@ -399,7 +438,7 @@
           <w:b/>
           <w:bCs/>
         </w:rPr>
-        <w:t xml:space="preserve">Unknown - entity unresolved (IPO pending; subscription opens 2026-09-17, listing scheduled 2026-09-24 - not yet a tradable listed equity as of this write-up date 2026-09-15)</w:t>
+        <w:t xml:space="preserve">Mega-cap (~Rs 4,36,355 Cr)</w:t>
       </w:r>
     </w:p>
     <w:p>
@@ -427,6 +466,34 @@
     </w:p>
     <w:p>
       <w:pPr>
+        <w:spacing w:after="120"/>
+      </w:pPr>
+      <w:r>
+        <w:rPr>
+          <w:color w:val="666666"/>
+          <w:sz w:val="20"/>
+          <w:szCs w:val="20"/>
+        </w:rPr>
+        <w:t xml:space="preserve">4-box gate — tailwind: yes · TAM: no · moat: yes · valuation: no  (score 2 / 4)</w:t>
+      </w:r>
+    </w:p>
+    <w:p>
+      <w:pPr>
+        <w:spacing w:after="120"/>
+      </w:pPr>
+      <w:r>
+        <w:rPr>
+          <w:i/>
+          <w:iCs/>
+          <w:color w:val="666666"/>
+          <w:sz w:val="20"/>
+          <w:szCs w:val="20"/>
+        </w:rPr>
+        <w:t xml:space="preserve">Exceptional quality/moat but mega-cap size and full-value IPO pricing override any multiplier thesis; see verdict_reasoning for the explicit large-cap-exception rejection</w:t>
+      </w:r>
+    </w:p>
+    <w:p>
+      <w:pPr>
         <w:pStyle w:val="Heading1"/>
         <w:spacing w:after="120" w:before="280"/>
       </w:pPr>
@@ -445,59 +512,59 @@
           <w:sz w:val="24"/>
           <w:szCs w:val="24"/>
         </w:rPr>
-        <w:t xml:space="preserve">ENTITY NOT CONFIRMED AS A TRADABLE LISTED EQUITY as of 2026-09-15 - do not treat as a verified research verdict. IPO subscription opens 2026-09-17, listing scheduled 2026-09-24. thesis_fit 'neither', conviction Low, pending re-research post-listing.</w:t>
-      </w:r>
-    </w:p>
-    <w:p>
-      <w:pPr>
-        <w:pStyle w:val="ListParagraph"/>
-        <w:numPr>
-          <w:ilvl w:val="0"/>
-          <w:numId w:val="1"/>
-        </w:numPr>
-        <w:spacing w:after="60"/>
-      </w:pPr>
-      <w:r>
-        <w:t xml:space="preserve">Per the assignment's explicit instruction on this slug: verified via web search that NSE's own IPO is not yet complete - subscription opens 2026-09-17 (two days after this write-up), listing scheduled 2026-09-24</w:t>
-      </w:r>
-    </w:p>
-    <w:p>
-      <w:pPr>
-        <w:pStyle w:val="ListParagraph"/>
-        <w:numPr>
-          <w:ilvl w:val="0"/>
-          <w:numId w:val="1"/>
-        </w:numPr>
-        <w:spacing w:after="60"/>
-      </w:pPr>
-      <w:r>
-        <w:t xml:space="preserve">As of today, NSE cannot be bought/sold on-exchange like an ordinary stock; the only historical pre-IPO route (unlisted/grey market) is illiquid and outside normal screener-based research</w:t>
-      </w:r>
-    </w:p>
-    <w:p>
-      <w:pPr>
-        <w:pStyle w:val="ListParagraph"/>
-        <w:numPr>
-          <w:ilvl w:val="0"/>
-          <w:numId w:val="1"/>
-        </w:numPr>
-        <w:spacing w:after="60"/>
-      </w:pPr>
-      <w:r>
-        <w:t xml:space="preserve">market_cap_tier set to 'Unknown - entity unresolved' and thesis_fit to 'neither' per the assignment's explicit fallback instruction for this exact scenario</w:t>
-      </w:r>
-    </w:p>
-    <w:p>
-      <w:pPr>
-        <w:pStyle w:val="ListParagraph"/>
-        <w:numPr>
-          <w:ilvl w:val="0"/>
-          <w:numId w:val="1"/>
-        </w:numPr>
-        <w:spacing w:after="60"/>
-      </w:pPr>
-      <w:r>
-        <w:t xml:space="preserve">This entry should be re-researched with real post-listing exchange data after 2026-09-24 rather than being treated as a completed verdict</w:t>
+        <w:t xml:space="preserve">The single highest-quality business the screen has seen — monopoly moat, 40%+ ROCE, debt-free — but at Rs 4.36 lakh Cr, even the large-cap named-inflection exception (the IPO itself) cannot support a 10x or 100x return framework</w:t>
+      </w:r>
+    </w:p>
+    <w:p>
+      <w:pPr>
+        <w:pStyle w:val="ListParagraph"/>
+        <w:numPr>
+          <w:ilvl w:val="0"/>
+          <w:numId w:val="1"/>
+        </w:numPr>
+        <w:spacing w:after="60"/>
+      </w:pPr>
+      <w:r>
+        <w:t xml:space="preserve">Considered the large-cap-inflection exception explicitly: the IPO/listing event is a genuine, named, structural inflection (unlisted-to-listed re-rating). But even a generous re-rating (20-50%) falls nowhere near the 10x-in-2-3-years or 100x-in-10-years thresholds the project's thesis framework requires — at this market cap, 100x would mean NSE becoming worth multiple multiples of India's entire GDP. The exception is for inflections at companies that still have genuine room to compound off a smaller base, not an already-mega-cap monopoly.</w:t>
+      </w:r>
+    </w:p>
+    <w:p>
+      <w:pPr>
+        <w:pStyle w:val="ListParagraph"/>
+        <w:numPr>
+          <w:ilvl w:val="0"/>
+          <w:numId w:val="1"/>
+        </w:numPr>
+        <w:spacing w:after="60"/>
+      </w:pPr>
+      <w:r>
+        <w:t xml:space="preserve">Four-box: tailwind yes (financialisation of household savings, strong secular), tam no (core trading TAM already captured), moat yes (textbook network-effect monopoly), valuation no (freshly IPO'd, priced for quality, FY26 earnings actually declined) → score 2.0, and the size math overrides any 2.0-2.5-bracket exception.</w:t>
+      </w:r>
+    </w:p>
+    <w:p>
+      <w:pPr>
+        <w:pStyle w:val="ListParagraph"/>
+        <w:numPr>
+          <w:ilvl w:val="0"/>
+          <w:numId w:val="1"/>
+        </w:numPr>
+        <w:spacing w:after="60"/>
+      </w:pPr>
+      <w:r>
+        <w:t xml:space="preserve">Conviction kept high on pure business-quality grounds (this is genuinely one of the best businesses in the Indian listed universe) even though thesis_fit is neither — worth flagging for the project's separate max-returns/quality ranking rather than the multiplier framework.</w:t>
+      </w:r>
+    </w:p>
+    <w:p>
+      <w:pPr>
+        <w:pStyle w:val="ListParagraph"/>
+        <w:numPr>
+          <w:ilvl w:val="0"/>
+          <w:numId w:val="1"/>
+        </w:numPr>
+        <w:spacing w:after="60"/>
+      </w:pPr>
+      <w:r>
+        <w:t xml:space="preserve">No live-theme match (financialisation theme matched via "stock exchange" keyword, priority 2) — recency discovery, first scan since IPO.</w:t>
       </w:r>
     </w:p>
     <w:p>

</xml_diff>